<commit_message>
Replace initial tool with updated ML prediction tool
</commit_message>
<xml_diff>
--- a/Paper_Final_Slim/Reviewer_Summary.docx
+++ b/Paper_Final_Slim/Reviewer_Summary.docx
@@ -20,7 +20,7 @@
     </w:p>
     <w:p>
       <w:r>
-        <w:t>Eleven representative machine learning algorithms were selected to span four major regression families: linear (Linear Regression, Ridge, Lasso), kernel-based (Support Vector Regression), a single decision tree, bagging ensembles (Random Forest, Extra Trees), and boosting ensembles (Gradient Boosting, XGBoost, LightGBM, CatBoost). These families were chosen because prior geotechnical machine-learning studies have consistently reported superior performance of ensemble and boosting methods for nonlinear SPT-based soil property prediction. All eleven algorithms were benchmarked under an identical borehole-group-aware cross-validation protocol to verify whether this trend held for the present Dinajpur dataset. Consistent with the literature, ensemble and boosting algorithms generally outperformed linear and kernel-based methods; the highest-performing algorithm for each target property was therefore selected for deployment in the final prediction tool. The full eleven-model benchmark is provided as supplementary material.</w:t>
+        <w:t>Eleven representative machine learning algorithms were selected to span four major regression families: linear (Linear Regression, Ridge, Lasso), kernel-based (Support Vector Regression), a single decision tree, bagging ensembles (Random Forest, Extra Trees), and boosting ensembles (Gradient Boosting, XGBoost, LightGBM, CatBoost). These families were included to represent a broad range of model complexities and inductive biases relevant to nonlinear, tabular geotechnical data. For each target property, all eleven algorithms were benchmarked using the same borehole-group-aware train/test split, and the best-ranked algorithm for each target property was selected using test-set RMSE and MAE (rank-averaged), with |MBE| used only as a bias-check tie-breaker and Group-CV R2 kept as supporting robustness evidence -- that best-ranked algorithm was then used for deployment in the final prediction tool. The full eleven-model benchmark is provided as supplementary material.</w:t>
       </w:r>
     </w:p>
     <w:p>
@@ -112,7 +112,7 @@
           </w:tcPr>
           <w:p>
             <w:r>
-              <w:t>Gradient Boosting</w:t>
+              <w:t>Extra Trees</w:t>
             </w:r>
           </w:p>
         </w:tc>
@@ -132,7 +132,7 @@
           </w:tcPr>
           <w:p>
             <w:r>
-              <w:t>Gradient Boosting</w:t>
+              <w:t>Extra Trees</w:t>
             </w:r>
           </w:p>
         </w:tc>
@@ -154,110 +154,6 @@
           </w:tcPr>
           <w:p>
             <w:r>
-              <w:t>GAMMA_WET</w:t>
-            </w:r>
-          </w:p>
-        </w:tc>
-        <w:tc>
-          <w:tcPr>
-            <w:tcW w:type="dxa" w:w="1728"/>
-          </w:tcPr>
-          <w:p>
-            <w:r>
-              <w:t>XGBoost</w:t>
-            </w:r>
-          </w:p>
-        </w:tc>
-        <w:tc>
-          <w:tcPr>
-            <w:tcW w:type="dxa" w:w="1728"/>
-          </w:tcPr>
-          <w:p>
-            <w:r>
-              <w:t>gamma_wet_best_model.pkl</w:t>
-            </w:r>
-          </w:p>
-        </w:tc>
-        <w:tc>
-          <w:tcPr>
-            <w:tcW w:type="dxa" w:w="1728"/>
-          </w:tcPr>
-          <w:p>
-            <w:r>
-              <w:t>XGBoost</w:t>
-            </w:r>
-          </w:p>
-        </w:tc>
-        <w:tc>
-          <w:tcPr>
-            <w:tcW w:type="dxa" w:w="1728"/>
-          </w:tcPr>
-          <w:p>
-            <w:r>
-              <w:t>gamma_wet_best_model.pkl</w:t>
-            </w:r>
-          </w:p>
-        </w:tc>
-      </w:tr>
-      <w:tr>
-        <w:tc>
-          <w:tcPr>
-            <w:tcW w:type="dxa" w:w="1728"/>
-          </w:tcPr>
-          <w:p>
-            <w:r>
-              <w:t>GAMMA_DRY</w:t>
-            </w:r>
-          </w:p>
-        </w:tc>
-        <w:tc>
-          <w:tcPr>
-            <w:tcW w:type="dxa" w:w="1728"/>
-          </w:tcPr>
-          <w:p>
-            <w:r>
-              <w:t>XGBoost</w:t>
-            </w:r>
-          </w:p>
-        </w:tc>
-        <w:tc>
-          <w:tcPr>
-            <w:tcW w:type="dxa" w:w="1728"/>
-          </w:tcPr>
-          <w:p>
-            <w:r>
-              <w:t>gamma_dry_best_model.pkl</w:t>
-            </w:r>
-          </w:p>
-        </w:tc>
-        <w:tc>
-          <w:tcPr>
-            <w:tcW w:type="dxa" w:w="1728"/>
-          </w:tcPr>
-          <w:p>
-            <w:r>
-              <w:t>XGBoost</w:t>
-            </w:r>
-          </w:p>
-        </w:tc>
-        <w:tc>
-          <w:tcPr>
-            <w:tcW w:type="dxa" w:w="1728"/>
-          </w:tcPr>
-          <w:p>
-            <w:r>
-              <w:t>gamma_dry_best_model.pkl</w:t>
-            </w:r>
-          </w:p>
-        </w:tc>
-      </w:tr>
-      <w:tr>
-        <w:tc>
-          <w:tcPr>
-            <w:tcW w:type="dxa" w:w="1728"/>
-          </w:tcPr>
-          <w:p>
-            <w:r>
               <w:t>SP_GR</w:t>
             </w:r>
           </w:p>
@@ -268,7 +164,7 @@
           </w:tcPr>
           <w:p>
             <w:r>
-              <w:t>Extra Trees</w:t>
+              <w:t>CatBoost</w:t>
             </w:r>
           </w:p>
         </w:tc>
@@ -288,7 +184,7 @@
           </w:tcPr>
           <w:p>
             <w:r>
-              <w:t>Extra Trees</w:t>
+              <w:t>CatBoost</w:t>
             </w:r>
           </w:p>
         </w:tc>
@@ -320,7 +216,7 @@
           </w:tcPr>
           <w:p>
             <w:r>
-              <w:t>Decision Tree</w:t>
+              <w:t>Extra Trees</w:t>
             </w:r>
           </w:p>
         </w:tc>
@@ -340,7 +236,7 @@
           </w:tcPr>
           <w:p>
             <w:r>
-              <w:t>Gradient Boosting</w:t>
+              <w:t>Extra Trees</w:t>
             </w:r>
           </w:p>
         </w:tc>
@@ -350,7 +246,7 @@
           </w:tcPr>
           <w:p>
             <w:r>
-              <w:t>cohesion_tool_model.pkl</w:t>
+              <w:t>cohesion_best_model.pkl</w:t>
             </w:r>
           </w:p>
         </w:tc>
@@ -372,7 +268,7 @@
           </w:tcPr>
           <w:p>
             <w:r>
-              <w:t>Gradient Boosting</w:t>
+              <w:t>CatBoost</w:t>
             </w:r>
           </w:p>
         </w:tc>
@@ -392,7 +288,7 @@
           </w:tcPr>
           <w:p>
             <w:r>
-              <w:t>Gradient Boosting</w:t>
+              <w:t>CatBoost</w:t>
             </w:r>
           </w:p>
         </w:tc>
@@ -413,12 +309,31 @@
         <w:pStyle w:val="Heading1"/>
       </w:pPr>
       <w:r>
-        <w:t>3. Methodological Note on Cohesion Selection</w:t>
+        <w:t>3. Limitations</w:t>
       </w:r>
     </w:p>
     <w:p>
+      <w:pPr>
+        <w:pStyle w:val="ListBullet"/>
+      </w:pPr>
       <w:r>
-        <w:t>Decision Tree achieved the highest independent test-set R² for cohesion and was therefore, whereas Gradient Boosting achieved higher Group CV R² (0.938 vs 0.927), lower fold-to-fold variability, and lower expected overfitting risk.retained as the benchmark model for paper reporting consistency. However, the deployed prediction tool uses Gradient Boosting for cohesion because it demonstrated superior borehole-group cross-validation performance, lower variability across folds, and a lower expected risk of overfitting during future field prediction.</w:t>
+        <w:t>All performance metrics are based on a group-aware train-test split per target; results should be treated as indicative.</w:t>
+      </w:r>
+    </w:p>
+    <w:p>
+      <w:pPr>
+        <w:pStyle w:val="ListBullet"/>
+      </w:pPr>
+      <w:r>
+        <w:t>The residual bootstrap uncertainty band reported for each target is an in-sample diagnostic -- it is constructed from, and its coverage checked against, the same holdout residuals -- and should not be interpreted as an independently validated 95% prediction interval.</w:t>
+      </w:r>
+    </w:p>
+    <w:p>
+      <w:pPr>
+        <w:pStyle w:val="ListBullet"/>
+      </w:pPr>
+      <w:r>
+        <w:t>The training dataset contained no laboratory Angle of Friction (phi) or Cohesion values for Clay(CL) samples; the deployed prediction tool therefore does not predict phi or cohesion for Clay(CL), while Specific Gravity and Moisture Content remain available for that soil type.</w:t>
       </w:r>
     </w:p>
     <w:sectPr>

</xml_diff>